<commit_message>
PS5 Q3: document the 2015-2017 aggregate-MSA (aMSA_) OEWS workbooks
Per Claudia's review: section 2 now states that for 2015-2017 the aMSA_ file was read,
because BLS reports the 11 largest metro areas only by metropolitan division in the MSA
file those years (114 metro counties, 9.2%). Code already read it; docs now match.

Co-Authored-By: Claude Opus 5.5 <noreply@anthropic.com>
</commit_message>
<xml_diff>
--- a/PS5_Q3_writeup.docx
+++ b/PS5_Q3_writeup.docx
@@ -832,7 +832,40 @@
         <w:t xml:space="preserve">BOS_M20YY_dl.xlsx</w:t>
       </w:r>
       <w:r>
-        <w:t xml:space="preserve">) workbooks and kept occupation</w:t>
+        <w:t xml:space="preserve">) workbooks and, for 2015–2017, the aggregate-MSA workbook (</w:t>
+      </w:r>
+      <w:r>
+        <w:rPr>
+          <w:rStyle w:val="VerbatimChar"/>
+        </w:rPr>
+        <w:t xml:space="preserve">aMSA_M20YY_dl.xlsx</w:t>
+      </w:r>
+      <w:r>
+        <w:t xml:space="preserve">), since in</w:t>
+      </w:r>
+      <w:r>
+        <w:t xml:space="preserve"> </w:t>
+      </w:r>
+      <w:r>
+        <w:t xml:space="preserve">those years BLS reports the 11 largest metro areas in the MSA file only by metropolitan division. Those 11 areas (New</w:t>
+      </w:r>
+      <w:r>
+        <w:t xml:space="preserve"> </w:t>
+      </w:r>
+      <w:r>
+        <w:t xml:space="preserve">York, Los Angeles, Chicago, Dallas, Washington, Miami, Philadelphia, Boston, San Francisco, Detroit and Seattle) cover</w:t>
+      </w:r>
+      <w:r>
+        <w:t xml:space="preserve"> </w:t>
+      </w:r>
+      <w:r>
+        <w:t xml:space="preserve">114 metro counties (9.2%); without the aMSA file, they would have no wage in 2015–2017. From 2018 BLS publishes these</w:t>
+      </w:r>
+      <w:r>
+        <w:t xml:space="preserve"> </w:t>
+      </w:r>
+      <w:r>
+        <w:t xml:space="preserve">areas in the MSA file and no aMSA file exists. We kept occupation</w:t>
       </w:r>
       <w:r>
         <w:t xml:space="preserve"> </w:t>
@@ -859,13 +892,7 @@
         <w:t xml:space="preserve"> </w:t>
       </w:r>
       <w:r>
-        <w:t xml:space="preserve">(mean annual</w:t>
-      </w:r>
-      <w:r>
-        <w:t xml:space="preserve"> </w:t>
-      </w:r>
-      <w:r>
-        <w:t xml:space="preserve">wage, nominal $). The area code was zero-padded to 7 characters (e.g. </w:t>
+        <w:t xml:space="preserve">(mean annual wage, nominal $). The area code was zero-padded to 7 characters (e.g. </w:t>
       </w:r>
       <w:r>
         <w:rPr>
@@ -1181,6 +1208,107 @@
             </w:pPr>
             <w:r>
               <w:t xml:space="preserve">384</w:t>
+            </w:r>
+          </w:p>
+        </w:tc>
+      </w:tr>
+      <w:tr>
+        <w:tc>
+          <w:p>
+            <w:pPr>
+              <w:pStyle w:val="Compact"/>
+              <w:jc w:val="left"/>
+            </w:pPr>
+            <w:r>
+              <w:t xml:space="preserve">… of which from the aMSA file</w:t>
+            </w:r>
+          </w:p>
+        </w:tc>
+        <w:tc>
+          <w:p>
+            <w:pPr>
+              <w:pStyle w:val="Compact"/>
+              <w:jc w:val="left"/>
+            </w:pPr>
+            <w:r>
+              <w:t xml:space="preserve">11</w:t>
+            </w:r>
+          </w:p>
+        </w:tc>
+        <w:tc>
+          <w:p>
+            <w:pPr>
+              <w:pStyle w:val="Compact"/>
+              <w:jc w:val="left"/>
+            </w:pPr>
+            <w:r>
+              <w:t xml:space="preserve">11</w:t>
+            </w:r>
+          </w:p>
+        </w:tc>
+        <w:tc>
+          <w:p>
+            <w:pPr>
+              <w:pStyle w:val="Compact"/>
+              <w:jc w:val="left"/>
+            </w:pPr>
+            <w:r>
+              <w:t xml:space="preserve">11</w:t>
+            </w:r>
+          </w:p>
+        </w:tc>
+        <w:tc>
+          <w:p>
+            <w:pPr>
+              <w:pStyle w:val="Compact"/>
+              <w:jc w:val="left"/>
+            </w:pPr>
+            <w:r>
+              <w:t xml:space="preserve">–</w:t>
+            </w:r>
+          </w:p>
+        </w:tc>
+        <w:tc>
+          <w:p>
+            <w:pPr>
+              <w:pStyle w:val="Compact"/>
+              <w:jc w:val="left"/>
+            </w:pPr>
+            <w:r>
+              <w:t xml:space="preserve">–</w:t>
+            </w:r>
+          </w:p>
+        </w:tc>
+        <w:tc>
+          <w:p>
+            <w:pPr>
+              <w:pStyle w:val="Compact"/>
+              <w:jc w:val="left"/>
+            </w:pPr>
+            <w:r>
+              <w:t xml:space="preserve">–</w:t>
+            </w:r>
+          </w:p>
+        </w:tc>
+        <w:tc>
+          <w:p>
+            <w:pPr>
+              <w:pStyle w:val="Compact"/>
+              <w:jc w:val="left"/>
+            </w:pPr>
+            <w:r>
+              <w:t xml:space="preserve">–</w:t>
+            </w:r>
+          </w:p>
+        </w:tc>
+        <w:tc>
+          <w:p>
+            <w:pPr>
+              <w:pStyle w:val="Compact"/>
+              <w:jc w:val="left"/>
+            </w:pPr>
+            <w:r>
+              <w:t xml:space="preserve">–</w:t>
             </w:r>
           </w:p>
         </w:tc>
@@ -5556,6 +5684,42 @@
       </w:r>
       <w:r>
         <w:t xml:space="preserve">variables (1.2% of the metro population; not influential).</w:t>
+      </w:r>
+    </w:p>
+    <w:p>
+      <w:pPr>
+        <w:numPr>
+          <w:ilvl w:val="0"/>
+          <w:numId w:val="1003"/>
+        </w:numPr>
+        <w:pStyle w:val="Compact"/>
+      </w:pPr>
+      <w:r>
+        <w:rPr>
+          <w:b/>
+        </w:rPr>
+        <w:t xml:space="preserve">OEWS files for 2015–2017</w:t>
+      </w:r>
+      <w:r>
+        <w:t xml:space="preserve"> </w:t>
+      </w:r>
+      <w:r>
+        <w:t xml:space="preserve">include the aggregate-MSA workbook (</w:t>
+      </w:r>
+      <w:r>
+        <w:rPr>
+          <w:rStyle w:val="VerbatimChar"/>
+        </w:rPr>
+        <w:t xml:space="preserve">aMSA_</w:t>
+      </w:r>
+      <w:r>
+        <w:t xml:space="preserve">), which holds the 11 largest metro</w:t>
+      </w:r>
+      <w:r>
+        <w:t xml:space="preserve"> </w:t>
+      </w:r>
+      <w:r>
+        <w:t xml:space="preserve">areas that the MSA file reports only by metropolitan division (114 metro counties).</w:t>
       </w:r>
     </w:p>
     <w:p>

</xml_diff>

<commit_message>
PS5 Q3: apply Gary's review (Welch-t CI, consistent independence/variance wording)
- Q6 CI uses the Welch t critical value (1.961): [$157, $812] instead of [$158, $812]
- "separate samples" wording that matches the paired-test footnote
- variance wording matches footnote 2 (Bartlett rejects, Levene does not)
- paired-test footnote moved next to the test; note that wage-panel lines coincide

Co-Authored-By: Claude Opus 5.5 <noreply@anthropic.com>
</commit_message>
<xml_diff>
--- a/PS5_Q3_writeup.docx
+++ b/PS5_Q3_writeup.docx
@@ -3348,7 +3348,13 @@
         <w:t xml:space="preserve"> </w:t>
       </w:r>
       <w:r>
-        <w:t xml:space="preserve">counties with both variables in every year, dashed lines) tracks the full sample almost exactly.</w:t>
+        <w:t xml:space="preserve">counties with both variables in every year, dashed lines) tracks the full sample almost exactly (in the wage panel</w:t>
+      </w:r>
+      <w:r>
+        <w:t xml:space="preserve"> </w:t>
+      </w:r>
+      <w:r>
+        <w:t xml:space="preserve">the two lines coincide).</w:t>
       </w:r>
     </w:p>
     <w:bookmarkEnd w:id="27"/>
@@ -3576,25 +3582,31 @@
         <w:t xml:space="preserve"> </w:t>
       </w:r>
       <w:r>
-        <w:t xml:space="preserve">The two years are independent samples: OEWS pools</w:t>
-      </w:r>
-      <w:r>
-        <w:t xml:space="preserve"> </w:t>
-      </w:r>
-      <w:r>
-        <w:t xml:space="preserve">three years of survey panels into each May estimate, and the May 2019 estimate (panels Nov 2016–May 2019) shares no</w:t>
-      </w:r>
-      <w:r>
-        <w:t xml:space="preserve"> </w:t>
-      </w:r>
-      <w:r>
-        <w:t xml:space="preserve">survey data with May 2022 (panels Nov 2019–May 2022). We use Welch’s version rather than a one-way ANOVA (which with</w:t>
-      </w:r>
-      <w:r>
-        <w:t xml:space="preserve"> </w:t>
-      </w:r>
-      <w:r>
-        <w:t xml:space="preserve">two groups is the pooled-variance</w:t>
+        <w:t xml:space="preserve">We compare the two years as separate samples. OEWS</w:t>
+      </w:r>
+      <w:r>
+        <w:t xml:space="preserve"> </w:t>
+      </w:r>
+      <w:r>
+        <w:t xml:space="preserve">pools three years of survey panels into each May estimate, and the May 2019 estimate (panels Nov 2016–May 2019)</w:t>
+      </w:r>
+      <w:r>
+        <w:t xml:space="preserve"> </w:t>
+      </w:r>
+      <w:r>
+        <w:t xml:space="preserve">shares no survey data with May 2022 (panels Nov 2019–May 2022), though the same counties appear in both years (see</w:t>
+      </w:r>
+      <w:r>
+        <w:t xml:space="preserve"> </w:t>
+      </w:r>
+      <w:r>
+        <w:t xml:space="preserve">footnote 3 for the paired test). We use Welch’s version rather than a one-way ANOVA (which with two groups is the</w:t>
+      </w:r>
+      <w:r>
+        <w:t xml:space="preserve"> </w:t>
+      </w:r>
+      <w:r>
+        <w:t xml:space="preserve">pooled-variance</w:t>
       </w:r>
       <w:r>
         <w:t xml:space="preserve"> </w:t>
@@ -3615,22 +3627,28 @@
         <w:rPr>
           <w:b/>
         </w:rPr>
-        <w:t xml:space="preserve">because the spread of wages differs between the two years</w:t>
-      </w:r>
-      <w:r>
-        <w:t xml:space="preserve">: the 2022</w:t>
-      </w:r>
-      <w:r>
-        <w:t xml:space="preserve"> </w:t>
-      </w:r>
-      <w:r>
-        <w:t xml:space="preserve">SD ($4,337) is 11% larger than the 2019 SD ($3,897), and a Bartlett test rejects equal variances (p = 0.0002).</w:t>
-      </w:r>
-      <w:r>
-        <w:t xml:space="preserve"> </w:t>
-      </w:r>
-      <w:r>
-        <w:t xml:space="preserve">Welch’s test does not assume the two variances are equal.</w:t>
+        <w:t xml:space="preserve">because Welch does not require equal variances, and the spread of wages differs between</w:t>
+      </w:r>
+      <w:r>
+        <w:rPr>
+          <w:b/>
+        </w:rPr>
+        <w:t xml:space="preserve"> </w:t>
+      </w:r>
+      <w:r>
+        <w:rPr>
+          <w:b/>
+        </w:rPr>
+        <w:t xml:space="preserve">the years</w:t>
+      </w:r>
+      <w:r>
+        <w:t xml:space="preserve">: the 2022 SD ($4,337) is 11% larger than the 2019 SD ($3,897). A Bartlett test rejects equal variances</w:t>
+      </w:r>
+      <w:r>
+        <w:t xml:space="preserve"> </w:t>
+      </w:r>
+      <w:r>
+        <w:t xml:space="preserve">(p = 0.0002), though the more robust Levene test does not.</w:t>
       </w:r>
       <w:r>
         <w:rPr>
@@ -4606,13 +4624,60 @@
         </m:r>
       </m:oMath>
       <w:r>
-        <w:t xml:space="preserve">. The 95% CI for the</w:t>
-      </w:r>
-      <w:r>
-        <w:t xml:space="preserve"> </w:t>
-      </w:r>
-      <w:r>
-        <w:t xml:space="preserve">change is [$158, $812] per year.</w:t>
+        <w:t xml:space="preserve">.</w:t>
+      </w:r>
+      <w:r>
+        <w:rPr>
+          <w:rStyle w:val="FootnoteReference"/>
+        </w:rPr>
+        <w:footnoteReference w:id="29"/>
+      </w:r>
+      <w:r>
+        <w:t xml:space="preserve"> </w:t>
+      </w:r>
+      <w:r>
+        <w:t xml:space="preserve">The 95% CI for</w:t>
+      </w:r>
+      <w:r>
+        <w:t xml:space="preserve"> </w:t>
+      </w:r>
+      <w:r>
+        <w:t xml:space="preserve">the change, using the Welch critical value</w:t>
+      </w:r>
+      <w:r>
+        <w:t xml:space="preserve"> </w:t>
+      </w:r>
+      <m:oMath>
+        <m:sSub>
+          <m:e>
+            <m:r>
+              <m:t>t</m:t>
+            </m:r>
+          </m:e>
+          <m:sub>
+            <m:r>
+              <m:t>0.975</m:t>
+            </m:r>
+            <m:r>
+              <m:t>,</m:t>
+            </m:r>
+            <m:r>
+              <m:t> </m:t>
+            </m:r>
+            <m:r>
+              <m:t>2408.5</m:t>
+            </m:r>
+          </m:sub>
+        </m:sSub>
+        <m:r>
+          <m:t>=</m:t>
+        </m:r>
+        <m:r>
+          <m:t>1.961</m:t>
+        </m:r>
+      </m:oMath>
+      <w:r>
+        <w:t xml:space="preserve">, is [$157, $812] per year.</w:t>
       </w:r>
     </w:p>
     <w:p>
@@ -4827,12 +4892,6 @@
       </w:r>
       <w:r>
         <w:t xml:space="preserve">to what centers charge, a margin squeeze consistent with providers’ complaints, even though wages did not surge.</w:t>
-      </w:r>
-      <w:r>
-        <w:rPr>
-          <w:rStyle w:val="FootnoteReference"/>
-        </w:rPr>
-        <w:footnoteReference w:id="29"/>
       </w:r>
     </w:p>
     <w:bookmarkEnd w:id="30"/>

</xml_diff>